<commit_message>
ERP Phase 2 operational workflow foundation
</commit_message>
<xml_diff>
--- a/testing report 6-4-26.docx
+++ b/testing report 6-4-26.docx
@@ -450,6 +450,66 @@
           </w:p>
         </w:tc>
       </w:tr>
+      <w:tr>
+        <w:tc>
+          <w:tcPr>
+            <w:tcW w:w="0" w:type="auto"/>
+            <w:noWrap/>
+          </w:tcPr>
+          <w:p>
+            <w:hyperlink r:id="rId9" w:history="1">
+              <w:r>
+                <w:rPr>
+                  <w:rStyle w:val="Hyperlink"/>
+                </w:rPr>
+                <w:t>Accounts@test.com</w:t>
+              </w:r>
+            </w:hyperlink>
+          </w:p>
+        </w:tc>
+        <w:tc>
+          <w:tcPr>
+            <w:tcW w:w="0" w:type="auto"/>
+            <w:noWrap/>
+          </w:tcPr>
+          <w:p>
+            <w:pPr>
+              <w:rPr>
+                <w:b/>
+                <w:bCs/>
+              </w:rPr>
+            </w:pPr>
+            <w:r>
+              <w:rPr>
+                <w:b/>
+                <w:bCs/>
+              </w:rPr>
+              <w:t>Yes</w:t>
+            </w:r>
+          </w:p>
+        </w:tc>
+        <w:tc>
+          <w:tcPr>
+            <w:tcW w:w="0" w:type="auto"/>
+            <w:noWrap/>
+          </w:tcPr>
+          <w:p>
+            <w:r>
+              <w:t>Accounts</w:t>
+            </w:r>
+          </w:p>
+        </w:tc>
+        <w:tc>
+          <w:tcPr>
+            <w:tcW w:w="0" w:type="auto"/>
+          </w:tcPr>
+          <w:p>
+            <w:r>
+              <w:t>123456</w:t>
+            </w:r>
+          </w:p>
+        </w:tc>
+      </w:tr>
     </w:tbl>
     <w:p>
       <w:pPr>
@@ -505,27 +565,13 @@
         <w:rPr>
           <w:lang w:val="en-US"/>
         </w:rPr>
-        <w:t xml:space="preserve">– </w:t>
-      </w:r>
-      <w:proofErr w:type="gramStart"/>
-      <w:r>
-        <w:rPr>
-          <w:lang w:val="en-US"/>
-        </w:rPr>
-        <w:t>OK</w:t>
+        <w:t>– OK</w:t>
       </w:r>
       <w:r>
         <w:rPr>
           <w:lang w:val="en-US"/>
         </w:rPr>
-        <w:t xml:space="preserve"> ,</w:t>
-      </w:r>
-      <w:proofErr w:type="gramEnd"/>
-      <w:r>
-        <w:rPr>
-          <w:lang w:val="en-US"/>
-        </w:rPr>
-        <w:t xml:space="preserve"> </w:t>
+        <w:t xml:space="preserve"> , </w:t>
       </w:r>
       <w:r>
         <w:rPr>
@@ -544,13 +590,7 @@
         <w:rPr>
           <w:lang w:val="en-US"/>
         </w:rPr>
-        <w:t xml:space="preserve">Items - </w:t>
-      </w:r>
-      <w:r>
-        <w:rPr>
-          <w:lang w:val="en-US"/>
-        </w:rPr>
-        <w:t>Create/alter/Delete &amp; Prevent Duplication– OK</w:t>
+        <w:t>Items - Create/alter/Delete &amp; Prevent Duplication– OK</w:t>
       </w:r>
     </w:p>
     <w:p>
@@ -563,27 +603,7 @@
         <w:rPr>
           <w:lang w:val="en-US"/>
         </w:rPr>
-        <w:t xml:space="preserve">Suppliers - </w:t>
-      </w:r>
-      <w:r>
-        <w:rPr>
-          <w:lang w:val="en-US"/>
-        </w:rPr>
-        <w:t xml:space="preserve">Create/alter/Delete – </w:t>
-      </w:r>
-      <w:proofErr w:type="gramStart"/>
-      <w:r>
-        <w:rPr>
-          <w:lang w:val="en-US"/>
-        </w:rPr>
-        <w:t>OK ,</w:t>
-      </w:r>
-      <w:proofErr w:type="gramEnd"/>
-      <w:r>
-        <w:rPr>
-          <w:lang w:val="en-US"/>
-        </w:rPr>
-        <w:t xml:space="preserve"> Prevent Duplication – ON for Names Only, it should be ON for GST, Contact &amp; Email</w:t>
+        <w:t>Suppliers - Create/alter/Delete – OK , Prevent Duplication – ON for Names Only, it should be ON for GST, Contact &amp; Email</w:t>
       </w:r>
     </w:p>
     <w:p>
@@ -602,21 +622,7 @@
         <w:rPr>
           <w:lang w:val="en-US"/>
         </w:rPr>
-        <w:t xml:space="preserve">– </w:t>
-      </w:r>
-      <w:proofErr w:type="gramStart"/>
-      <w:r>
-        <w:rPr>
-          <w:lang w:val="en-US"/>
-        </w:rPr>
-        <w:t>OK  -</w:t>
-      </w:r>
-      <w:proofErr w:type="gramEnd"/>
-      <w:r>
-        <w:rPr>
-          <w:lang w:val="en-US"/>
-        </w:rPr>
-        <w:t xml:space="preserve">  need to work on UI, beside show current available stock</w:t>
+        <w:t>– OK  -  need to work on UI, beside show current available stock</w:t>
       </w:r>
     </w:p>
     <w:p>
@@ -1239,6 +1245,7 @@
   <w:style w:type="character" w:default="1" w:styleId="DefaultParagraphFont">
     <w:name w:val="Default Paragraph Font"/>
     <w:uiPriority w:val="1"/>
+    <w:semiHidden/>
     <w:unhideWhenUsed/>
   </w:style>
   <w:style w:type="table" w:default="1" w:styleId="TableNormal">

</xml_diff>